<commit_message>
docs(spanner): add patch workflow diagrams
Co-authored-by: Copilot <223556219+Copilot@users.noreply.github.com>
Copilot-Session: 5c82dd58-8da0-4249-b63f-8328260be747
</commit_message>
<xml_diff>
--- a/specs/002-patch-api/spanner-design.docx
+++ b/specs/002-patch-api/spanner-design.docx
@@ -2,7 +2,7 @@
 <file path=word/document.xml><?xml version="1.0" encoding="utf-8"?>
 <w:document xmlns:w="http://schemas.openxmlformats.org/wordprocessingml/2006/main" xmlns:m="http://schemas.openxmlformats.org/officeDocument/2006/math" xmlns:r="http://schemas.openxmlformats.org/officeDocument/2006/relationships" xmlns:o="urn:schemas-microsoft-com:office:office" xmlns:v="urn:schemas-microsoft-com:vml" xmlns:w10="urn:schemas-microsoft-com:office:word" xmlns:a="http://schemas.openxmlformats.org/drawingml/2006/main" xmlns:pic="http://schemas.openxmlformats.org/drawingml/2006/picture" xmlns:wp="http://schemas.openxmlformats.org/drawingml/2006/wordprocessingDrawing">
   <w:body>
-    <w:bookmarkStart w:id="21" w:name="spanner-patch---deferred-design"/>
+    <w:bookmarkStart w:id="27" w:name="spanner-patch---deferred-design"/>
     <w:p>
       <w:pPr>
         <w:pStyle w:val="Heading1"/>
@@ -295,7 +295,7 @@
       </w:r>
     </w:p>
     <w:bookmarkEnd w:id="10"/>
-    <w:bookmarkStart w:id="11" w:name="X585e3a81b300f3e448020e746d6ab7f516581f2"/>
+    <w:bookmarkStart w:id="14" w:name="X585e3a81b300f3e448020e746d6ab7f516581f2"/>
     <w:p>
       <w:pPr>
         <w:pStyle w:val="Heading2"/>
@@ -436,8 +436,81 @@
         <w:t xml:space="preserve">architecture.</w:t>
       </w:r>
     </w:p>
-    <w:bookmarkEnd w:id="11"/>
-    <w:bookmarkStart w:id="12" w:name="Xb241760503788753a060a8d6e42c8e26e4ccc72"/>
+    <w:p>
+      <w:pPr>
+        <w:pStyle w:val="BodyText"/>
+      </w:pPr>
+      <w:r>
+        <w:drawing>
+          <wp:inline>
+            <wp:extent cx="5334000" cy="3200400"/>
+            <wp:effectExtent b="0" l="0" r="0" t="0"/>
+            <wp:docPr descr="Spanner prototype and target architecture" title="" id="12" name="Picture"/>
+            <a:graphic>
+              <a:graphicData uri="http://schemas.openxmlformats.org/drawingml/2006/picture">
+                <pic:pic>
+                  <pic:nvPicPr>
+                    <pic:cNvPr descr="images/spanner-prototype-vs-target.png" id="13" name="Picture"/>
+                    <pic:cNvPicPr>
+                      <a:picLocks noChangeArrowheads="1" noChangeAspect="1"/>
+                    </pic:cNvPicPr>
+                  </pic:nvPicPr>
+                  <pic:blipFill>
+                    <a:blip r:embed="rId11"/>
+                    <a:stretch>
+                      <a:fillRect/>
+                    </a:stretch>
+                  </pic:blipFill>
+                  <pic:spPr bwMode="auto">
+                    <a:xfrm>
+                      <a:off x="0" y="0"/>
+                      <a:ext cx="5334000" cy="3200400"/>
+                    </a:xfrm>
+                    <a:prstGeom prst="rect">
+                      <a:avLst/>
+                    </a:prstGeom>
+                    <a:noFill/>
+                    <a:ln w="9525">
+                      <a:noFill/>
+                      <a:headEnd/>
+                      <a:tailEnd/>
+                    </a:ln>
+                  </pic:spPr>
+                </pic:pic>
+              </a:graphicData>
+            </a:graphic>
+          </wp:inline>
+        </w:drawing>
+      </w:r>
+    </w:p>
+    <w:p>
+      <w:pPr>
+        <w:pStyle w:val="BodyText"/>
+      </w:pPr>
+      <w:r>
+        <w:rPr>
+          <w:i/>
+          <w:iCs/>
+        </w:rPr>
+        <w:t xml:space="preserve">Figure 1. The public PATCH contract stays unchanged; only the Spanner</w:t>
+      </w:r>
+      <w:r>
+        <w:rPr>
+          <w:i/>
+          <w:iCs/>
+        </w:rPr>
+        <w:t xml:space="preserve"> </w:t>
+      </w:r>
+      <w:r>
+        <w:rPr>
+          <w:i/>
+          <w:iCs/>
+        </w:rPr>
+        <w:t xml:space="preserve">provider's success path changes.</w:t>
+      </w:r>
+    </w:p>
+    <w:bookmarkEnd w:id="14"/>
+    <w:bookmarkStart w:id="15" w:name="Xb241760503788753a060a8d6e42c8e26e4ccc72"/>
     <w:p>
       <w:pPr>
         <w:pStyle w:val="Heading2"/>
@@ -987,8 +1060,8 @@
         <w:t xml:space="preserve">at all.</w:t>
       </w:r>
     </w:p>
-    <w:bookmarkEnd w:id="12"/>
-    <w:bookmarkStart w:id="13" w:name="Xb2465da9b34864d7a1579ee058b03741bd8296f"/>
+    <w:bookmarkEnd w:id="15"/>
+    <w:bookmarkStart w:id="19" w:name="Xb2465da9b34864d7a1579ee058b03741bd8296f"/>
     <w:p>
       <w:pPr>
         <w:pStyle w:val="Heading2"/>
@@ -1305,8 +1378,81 @@
         </w:tc>
       </w:tr>
     </w:tbl>
-    <w:bookmarkEnd w:id="13"/>
-    <w:bookmarkStart w:id="14" w:name="X5c3b08196cff31a0d82c4b5d03989183ce6bf73"/>
+    <w:p>
+      <w:pPr>
+        <w:pStyle w:val="BodyText"/>
+      </w:pPr>
+      <w:r>
+        <w:drawing>
+          <wp:inline>
+            <wp:extent cx="5334000" cy="3573780"/>
+            <wp:effectExtent b="0" l="0" r="0" t="0"/>
+            <wp:docPr descr="Proposed Spanner DML workflow" title="" id="17" name="Picture"/>
+            <a:graphic>
+              <a:graphicData uri="http://schemas.openxmlformats.org/drawingml/2006/picture">
+                <pic:pic>
+                  <pic:nvPicPr>
+                    <pic:cNvPr descr="images/spanner-target-dml-workflow.png" id="18" name="Picture"/>
+                    <pic:cNvPicPr>
+                      <a:picLocks noChangeArrowheads="1" noChangeAspect="1"/>
+                    </pic:cNvPicPr>
+                  </pic:nvPicPr>
+                  <pic:blipFill>
+                    <a:blip r:embed="rId16"/>
+                    <a:stretch>
+                      <a:fillRect/>
+                    </a:stretch>
+                  </pic:blipFill>
+                  <pic:spPr bwMode="auto">
+                    <a:xfrm>
+                      <a:off x="0" y="0"/>
+                      <a:ext cx="5334000" cy="3573780"/>
+                    </a:xfrm>
+                    <a:prstGeom prst="rect">
+                      <a:avLst/>
+                    </a:prstGeom>
+                    <a:noFill/>
+                    <a:ln w="9525">
+                      <a:noFill/>
+                      <a:headEnd/>
+                      <a:tailEnd/>
+                    </a:ln>
+                  </pic:spPr>
+                </pic:pic>
+              </a:graphicData>
+            </a:graphic>
+          </wp:inline>
+        </w:drawing>
+      </w:r>
+    </w:p>
+    <w:p>
+      <w:pPr>
+        <w:pStyle w:val="BodyText"/>
+      </w:pPr>
+      <w:r>
+        <w:rPr>
+          <w:i/>
+          <w:iCs/>
+        </w:rPr>
+        <w:t xml:space="preserve">Figure 2. A successful update has no point read; rejected state is read only</w:t>
+      </w:r>
+      <w:r>
+        <w:rPr>
+          <w:i/>
+          <w:iCs/>
+        </w:rPr>
+        <w:t xml:space="preserve"> </w:t>
+      </w:r>
+      <w:r>
+        <w:rPr>
+          <w:i/>
+          <w:iCs/>
+        </w:rPr>
+        <w:t xml:space="preserve">when the conditional DML affects zero rows.</w:t>
+      </w:r>
+    </w:p>
+    <w:bookmarkEnd w:id="19"/>
+    <w:bookmarkStart w:id="20" w:name="X5c3b08196cff31a0d82c4b5d03989183ce6bf73"/>
     <w:p>
       <w:pPr>
         <w:pStyle w:val="Heading2"/>
@@ -1477,8 +1623,8 @@
         <w:t xml:space="preserve">operate server-side over the existing string column.</w:t>
       </w:r>
     </w:p>
-    <w:bookmarkEnd w:id="14"/>
-    <w:bookmarkStart w:id="15" w:name="X40a02763b01549c76bb6cd577ca6c3b63e2102d"/>
+    <w:bookmarkEnd w:id="20"/>
+    <w:bookmarkStart w:id="21" w:name="X40a02763b01549c76bb6cd577ca6c3b63e2102d"/>
     <w:p>
       <w:pPr>
         <w:pStyle w:val="Heading2"/>
@@ -1565,8 +1711,8 @@
         <w:t xml:space="preserve">Queries, reads, and change feeds must return the same post-patch document.</w:t>
       </w:r>
     </w:p>
-    <w:bookmarkEnd w:id="15"/>
-    <w:bookmarkStart w:id="16" w:name="Xd5a43f01a0dea69f7ebd281db53842a0a4f8794"/>
+    <w:bookmarkEnd w:id="21"/>
+    <w:bookmarkStart w:id="22" w:name="Xd5a43f01a0dea69f7ebd281db53842a0a4f8794"/>
     <w:p>
       <w:pPr>
         <w:pStyle w:val="Heading2"/>
@@ -1729,8 +1875,8 @@
         <w:t xml:space="preserve">Capabilities stay unsupported until the related behavior is complete.</w:t>
       </w:r>
     </w:p>
-    <w:bookmarkEnd w:id="16"/>
-    <w:bookmarkStart w:id="17" w:name="Xfab061f6c83f9445c61a642aff30c5d1fda6478"/>
+    <w:bookmarkEnd w:id="22"/>
+    <w:bookmarkStart w:id="23" w:name="Xfab061f6c83f9445c61a642aff30c5d1fda6478"/>
     <w:p>
       <w:pPr>
         <w:pStyle w:val="Heading2"/>
@@ -1865,8 +2011,8 @@
         <w:t xml:space="preserve">Enable only the capabilities proven by the tests.</w:t>
       </w:r>
     </w:p>
-    <w:bookmarkEnd w:id="17"/>
-    <w:bookmarkStart w:id="18" w:name="X31a6cfd4e487453fb0228d62d03828dd1a3e72d"/>
+    <w:bookmarkEnd w:id="23"/>
+    <w:bookmarkStart w:id="24" w:name="X31a6cfd4e487453fb0228d62d03828dd1a3e72d"/>
     <w:p>
       <w:pPr>
         <w:pStyle w:val="Heading2"/>
@@ -1979,8 +2125,8 @@
         <w:t xml:space="preserve">Cosmos DB and DynamoDB behavior remains unchanged.</w:t>
       </w:r>
     </w:p>
-    <w:bookmarkEnd w:id="18"/>
-    <w:bookmarkStart w:id="19" w:name="X14ec3db197cfc5587873e001b9523f465e9714a"/>
+    <w:bookmarkEnd w:id="24"/>
+    <w:bookmarkStart w:id="25" w:name="X14ec3db197cfc5587873e001b9523f465e9714a"/>
     <w:p>
       <w:pPr>
         <w:pStyle w:val="Heading2"/>
@@ -2025,8 +2171,8 @@
         <w:t xml:space="preserve">guaranteed byte-level or billing reduction.</w:t>
       </w:r>
     </w:p>
-    <w:bookmarkEnd w:id="19"/>
-    <w:bookmarkStart w:id="20" w:name="Xfab9b23fa106d511e09e210125c8dcea5d76bc9"/>
+    <w:bookmarkEnd w:id="25"/>
+    <w:bookmarkStart w:id="26" w:name="Xfab9b23fa106d511e09e210125c8dcea5d76bc9"/>
     <w:p>
       <w:pPr>
         <w:pStyle w:val="Heading2"/>
@@ -2067,8 +2213,8 @@
         <w:t xml:space="preserve">capabilities only after shared conformance passes.</w:t>
       </w:r>
     </w:p>
-    <w:bookmarkEnd w:id="20"/>
-    <w:bookmarkEnd w:id="21"/>
+    <w:bookmarkEnd w:id="26"/>
+    <w:bookmarkEnd w:id="27"/>
     <w:sectPr>
       <w:footnotePr>
         <w:numRestart w:val="eachSect"/>

</xml_diff>